<commit_message>
Update my profile and publications
</commit_message>
<xml_diff>
--- a/2025上半年专利论文成果.docx
+++ b/2025上半年专利论文成果.docx
@@ -14,7 +14,7 @@
       </w:tblGrid>
       <w:tr>
         <w:trPr>
-          <w:trHeight w:val="1134"/>
+          <w:trHeight w:val="841"/>
         </w:trPr>
         <w:tc>
           <w:tcPr>
@@ -260,12 +260,14 @@
                 <w:rFonts w:hint="eastAsia"/>
               </w:rPr>
             </w:pPr>
+            <w:proofErr w:type="gramStart"/>
             <w:r>
               <w:rPr>
                 <w:rFonts w:hint="eastAsia"/>
               </w:rPr>
               <w:t>寇容海</w:t>
             </w:r>
+            <w:proofErr w:type="gramEnd"/>
           </w:p>
         </w:tc>
         <w:tc>

</xml_diff>